<commit_message>
docs: guias de containers, Kubernetes, fluxo CI/CD e teste de carga
- docs/CONTAINERS_K8S_GUIA.md: conceitos, cada container na mão, compose,
  Docker Hub e cluster k3d (explorar, balanceamento, auto-cura)
- docs/K8S_FLUXO_DEV_CICD.md: alterar cada container, PR/CI, Docker Hub,
  aprovação, Argo CD, ver produção, rollback, vários devs
- docs/K8S_TESTE_DE_CARGA.md: HPA, k6, resultados reais e testes de falha
- CLAUDE.md, DOCS.md, ARCHITECTURE, ROTEIRO, SETUP, STATUS e skill cicd-pipeline
  atualizados; aviso do TRUNCATE do test:integration; .docx regenerados

Co-Authored-By: Claude Opus 5.5 <noreply@anthropic.com>
</commit_message>
<xml_diff>
--- a/docs/ROTEIRO_CICD_CLAUDE_CODE.docx
+++ b/docs/ROTEIRO_CICD_CLAUDE_CODE.docx
@@ -2547,7 +2547,7 @@
         <w:rPr>
           <w:rStyle w:val="CommentTok"/>
         </w:rPr>
-        <w:t xml:space="preserve"># sobe postgres (5151), node (3000) e fornecedores (3001)</w:t>
+        <w:t xml:space="preserve"># sobe postgres (5151), frontend (3000), backend (3002) e fornecedores (3001)</w:t>
       </w:r>
       <w:r>
         <w:br/>
@@ -2595,7 +2595,7 @@
         <w:rPr>
           <w:rStyle w:val="NormalTok"/>
         </w:rPr>
-        <w:t xml:space="preserve"> node      </w:t>
+        <w:t xml:space="preserve"> backend      </w:t>
       </w:r>
       <w:r>
         <w:rPr>
@@ -3010,7 +3010,7 @@
               <w:t xml:space="preserve"> </w:t>
             </w:r>
             <w:r>
-              <w:t xml:space="preserve">build das 2 imagens + scan Trivy</w:t>
+              <w:t xml:space="preserve">build das 3 imagens (backend, fornecedores, frontend — desde 2026-10-29) + scan Trivy</w:t>
             </w:r>
           </w:p>
         </w:tc>
@@ -3043,7 +3043,7 @@
               <w:pStyle w:val="Compact"/>
             </w:pPr>
             <w:r>
-              <w:t xml:space="preserve">Build + scan e, se marcado nos inputs, publish no GHCR e/ou deploy</w:t>
+              <w:t xml:space="preserve">Build + scan e, se marcado nos inputs, publish no Docker Hub e/ou deploy</w:t>
             </w:r>
           </w:p>
         </w:tc>
@@ -3309,12 +3309,37 @@
       </w:r>
       <w:r>
         <w:rPr>
+          <w:b/>
+          <w:bCs/>
+        </w:rPr>
+        <w:t xml:space="preserve">Docker Hub</w:t>
+      </w:r>
+      <w:r>
+        <w:t xml:space="preserve"> </w:t>
+      </w:r>
+      <w:r>
+        <w:t xml:space="preserve">(</w:t>
+      </w:r>
+      <w:r>
+        <w:rPr>
+          <w:rStyle w:val="VerbatimChar"/>
+        </w:rPr>
+        <w:t xml:space="preserve">&lt;usuario&gt;/labsystem-&lt;serviço&gt;:&lt;sha&gt;</w:t>
+      </w:r>
+      <w:r>
+        <w:t xml:space="preserve">; até 2026-10-29 era o</w:t>
+      </w:r>
+      <w:r>
+        <w:t xml:space="preserve"> </w:t>
+      </w:r>
+      <w:r>
+        <w:rPr>
           <w:rStyle w:val="VerbatimChar"/>
         </w:rPr>
         <w:t xml:space="preserve">ghcr.io</w:t>
       </w:r>
       <w:r>
-        <w:t xml:space="preserve">. Só com disparo manual e</w:t>
+        <w:t xml:space="preserve">). Só com disparo manual e</w:t>
       </w:r>
       <w:r>
         <w:t xml:space="preserve"> </w:t>
@@ -3389,16 +3414,59 @@
         <w:t xml:space="preserve"> </w:t>
       </w:r>
       <w:r>
-        <w:t xml:space="preserve">(Required reviewers). Os comandos de deploy são placeholder (</w:t>
-      </w:r>
-      <w:r>
-        <w:rPr>
-          <w:rStyle w:val="VerbatimChar"/>
-        </w:rPr>
-        <w:t xml:space="preserve">echo</w:t>
-      </w:r>
-      <w:r>
-        <w:t xml:space="preserve">) — não há servidor de produção real neste laboratório.</w:t>
+        <w:t xml:space="preserve">(Required reviewers). Desde 2026-10-29 o deploy é</w:t>
+      </w:r>
+      <w:r>
+        <w:t xml:space="preserve"> </w:t>
+      </w:r>
+      <w:r>
+        <w:rPr>
+          <w:b/>
+          <w:bCs/>
+        </w:rPr>
+        <w:t xml:space="preserve">GitOps de verdade</w:t>
+      </w:r>
+      <w:r>
+        <w:t xml:space="preserve">: grava a nova tag em</w:t>
+      </w:r>
+      <w:r>
+        <w:t xml:space="preserve"> </w:t>
+      </w:r>
+      <w:r>
+        <w:rPr>
+          <w:rStyle w:val="VerbatimChar"/>
+        </w:rPr>
+        <w:t xml:space="preserve">k8s/overlays/producao</w:t>
+      </w:r>
+      <w:r>
+        <w:t xml:space="preserve"> </w:t>
+      </w:r>
+      <w:r>
+        <w:t xml:space="preserve">na branch</w:t>
+      </w:r>
+      <w:r>
+        <w:t xml:space="preserve"> </w:t>
+      </w:r>
+      <w:r>
+        <w:rPr>
+          <w:rStyle w:val="VerbatimChar"/>
+        </w:rPr>
+        <w:t xml:space="preserve">producao</w:t>
+      </w:r>
+      <w:r>
+        <w:t xml:space="preserve">, e o Argo CD aplica no cluster Kubernetes local — ver</w:t>
+      </w:r>
+      <w:r>
+        <w:t xml:space="preserve"> </w:t>
+      </w:r>
+      <w:r>
+        <w:rPr>
+          <w:rStyle w:val="VerbatimChar"/>
+        </w:rPr>
+        <w:t xml:space="preserve">docs/K8S_FLUXO_DEV_CICD.md</w:t>
+      </w:r>
+      <w:r>
+        <w:t xml:space="preserve">.</w:t>
       </w:r>
     </w:p>
     <w:p>

</xml_diff>

<commit_message>
docs: atualiza CLAUDE.md e documentação para 4 containers, Kubernetes e histórico de deploys
Co-Authored-By: Claude Sonnet 5.5 <noreply@anthropic.com>
</commit_message>
<xml_diff>
--- a/docs/ROTEIRO_CICD_CLAUDE_CODE.docx
+++ b/docs/ROTEIRO_CICD_CLAUDE_CODE.docx
@@ -2461,7 +2461,7 @@
               <w:pStyle w:val="Compact"/>
             </w:pPr>
             <w:r>
-              <w:t xml:space="preserve">Orquestra Postgres + Node + Python localmente (Redis/Mongo são adaptadores em memória, não precisam de serviço)</w:t>
+              <w:t xml:space="preserve">Orquestra frontend (nginx) + backend (Node) + Python + Postgres localmente (Redis/Mongo são adaptadores em memória, não precisam de serviço)</w:t>
             </w:r>
           </w:p>
         </w:tc>
@@ -3832,7 +3832,7 @@
         <w:rPr>
           <w:rStyle w:val="VerbatimChar"/>
         </w:rPr>
-        <w:t xml:space="preserve">Rode `docker compose up --build -d`, confirme que os 3 serviços sobem e que</w:t>
+        <w:t xml:space="preserve">Rode `docker compose up --build -d`, confirme que os 4 serviços sobem e que</w:t>
       </w:r>
       <w:r>
         <w:br/>

</xml_diff>